<commit_message>
Update report summary for completed TuSimple experiment
</commit_message>
<xml_diff>
--- a/docs/智能驾驶车道二分类实验报告.docx
+++ b/docs/智能驾驶车道二分类实验报告.docx
@@ -35,7 +35,7 @@
           <w:rFonts w:ascii="宋体" w:hAnsi="宋体" w:eastAsia="宋体"/>
           <w:sz w:val="21"/>
         </w:rPr>
-        <w:t>说明：本文档为当前阶段实验报告初稿。Toy 数据集已完成完整流程验证；TuSimple 开源车道线数据集下载完成后，可将真实数据训练结果、TensorBoard 截图和误差分析补入对应章节。</w:t>
+        <w:t>说明：本文档为当前阶段实验报告正式版。实验已完成 Toy 数据集流程验证，并基于 TuSimple 开源车道线数据集完成真实数据训练、测试、TensorBoard 记录、ONNX 导出和 ONNX Runtime 推理验证。</w:t>
       </w:r>
     </w:p>
     <w:p>
@@ -795,7 +795,7 @@
           <w:rFonts w:ascii="宋体" w:hAnsi="宋体" w:eastAsia="宋体"/>
           <w:sz w:val="21"/>
         </w:rPr>
-        <w:t>等待 TuSimple 下载完成后，使用 prepare_tusimple_binary.py 将开源车道线数据转换成正式二分类 ROI 数据集，并重新训练模型。</w:t>
+        <w:t>使用 prepare_tusimple_binary.py 将 TuSimple 开源车道线数据转换成正式二分类 ROI 数据集，并完成真实数据训练与测试。</w:t>
       </w:r>
     </w:p>
     <w:p>
@@ -1127,7 +1127,7 @@
           <w:rFonts w:ascii="宋体" w:hAnsi="宋体" w:eastAsia="宋体"/>
           <w:sz w:val="21"/>
         </w:rPr>
-        <w:t>TuSimple 数据集下载完成后，实验使用 label_data_0313.json 生成训练集，使用 label_data_0531.json 生成验证集，使用 label_data_0601.json 生成独立测试集。转换后训练集包含 2857 个 in_lane 样本和 5642 个 out_lane 样本；验证集包含 358 个 in_lane 样本和 702 个 out_lane 样本；测试集包含 410 个 in_lane 样本和 814 个 out_lane 样本。</w:t>
+        <w:t>TuSimple 数据集下载并解压后，实验使用 label_data_0313.json 生成训练集，使用 label_data_0531.json 生成验证集，使用 label_data_0601.json 生成独立测试集。转换后训练集包含 2857 个 in_lane 样本和 5642 个 out_lane 样本；验证集包含 358 个 in_lane 样本和 702 个 out_lane 样本；测试集包含 410 个 in_lane 样本和 814 个 out_lane 样本。</w:t>
       </w:r>
     </w:p>
     <w:tbl>
@@ -3074,7 +3074,7 @@
           <w:rFonts w:ascii="宋体" w:hAnsi="宋体" w:eastAsia="宋体"/>
           <w:sz w:val="21"/>
         </w:rPr>
-        <w:t>本实验完成了车道区域二分类模型的设计与工程实现。当前阶段已跑通 toy 数据集训练、TensorBoard 记录、PyTorch checkpoint 保存、ONNX 导出和 ONNX Runtime 独立推理，证明该方案具备完整的训练到部署验证流程。模型采用轻量 CNN 结构，能够基于车辆前方 ROI 对车道内外状态进行快速判断。</w:t>
+        <w:t>本实验完成了车道区域二分类模型的设计与工程实现，并已基于 TuSimple 开源车道线数据集完成正式训练、验证和测试。实验流程包括 TuSimple JSON 标注解析、ROI 二分类样本构建、轻量 CNN 训练、TensorBoard 记录、PyTorch checkpoint 保存、ONNX 导出和 ONNX Runtime 独立推理。最终模型在独立测试集上取得 accuracy 0.9665、precision 0.9301、recall 0.9732、F1 0.9511，说明该方案能够较稳定地完成车道内外 ROI 判断。</w:t>
       </w:r>
     </w:p>
     <w:p>
@@ -3087,7 +3087,7 @@
           <w:rFonts w:ascii="宋体" w:hAnsi="宋体" w:eastAsia="宋体"/>
           <w:sz w:val="21"/>
         </w:rPr>
-        <w:t>下一阶段将使用 TuSimple 开源车道线数据集进行正式训练。具体工作包括：完成数据下载与解压；使用转换脚本生成 train/val 二分类 ROI 数据；手动抽查样本质量；重新训练模型并记录 TensorBoard 曲线；导出真实数据训练得到的 ONNX 模型；补充真实数据指标、截图和误差分析。进一步还可以尝试 MobileNetV3、ResNet18 等轻量骨干网络，比较不同 ROI 尺寸、负样本偏移距离和增强策略对最终 F1 分数的影响。</w:t>
+        <w:t>下一阶段工作不再是接入 TuSimple，而是在当前真实数据实验基础上继续优化模型鲁棒性和部署表现。可进一步补充更多误差样例截图，重点分析 FP 样本，即真实为 out_lane 但被误判为 in_lane 的情况；尝试调整分类阈值以降低误判风险；比较不同 ROI 尺寸、y_ref 参考位置和负样本偏移距离对指标的影响；增加阴影、模糊、雨雾、强光等增强策略；尝试 MobileNetV3、ResNet18 等轻量骨干网络；并统计 ONNX Runtime 推理耗时，为后续边缘部署提供依据。</w:t>
       </w:r>
     </w:p>
     <w:p>

</xml_diff>

<commit_message>
Add TensorBoard and ONNX Runtime visuals to report
</commit_message>
<xml_diff>
--- a/docs/智能驾驶车道二分类实验报告.docx
+++ b/docs/智能驾驶车道二分类实验报告.docx
@@ -1102,6 +1102,57 @@
           <w:sz w:val="21"/>
         </w:rPr>
         <w:t>TensorBoard 中记录了 train 与 val 两组指标，每组包含 loss、accuracy、precision、recall 和 F1。训练过程中 loss 整体下降，F1 和 accuracy 逐步上升，说明模型在该验证数据上学习到了区分车道内外的视觉模式。</w:t>
+      </w:r>
+    </w:p>
+    <w:p>
+      <w:pPr>
+        <w:jc w:val="center"/>
+      </w:pPr>
+      <w:r>
+        <w:drawing>
+          <wp:inline xmlns:a="http://schemas.openxmlformats.org/drawingml/2006/main" xmlns:pic="http://schemas.openxmlformats.org/drawingml/2006/picture">
+            <wp:extent cx="6035040" cy="3931920"/>
+            <wp:docPr id="1" name="Picture 1"/>
+            <wp:cNvGraphicFramePr>
+              <a:graphicFrameLocks noChangeAspect="1"/>
+            </wp:cNvGraphicFramePr>
+            <a:graphic>
+              <a:graphicData uri="http://schemas.openxmlformats.org/drawingml/2006/picture">
+                <pic:pic>
+                  <pic:nvPicPr>
+                    <pic:cNvPr id="0" name="tensorboard_tusimple_curves.png"/>
+                    <pic:cNvPicPr/>
+                  </pic:nvPicPr>
+                  <pic:blipFill>
+                    <a:blip r:embed="rId9"/>
+                    <a:stretch>
+                      <a:fillRect/>
+                    </a:stretch>
+                  </pic:blipFill>
+                  <pic:spPr>
+                    <a:xfrm>
+                      <a:off x="0" y="0"/>
+                      <a:ext cx="6035040" cy="3931920"/>
+                    </a:xfrm>
+                    <a:prstGeom prst="rect"/>
+                  </pic:spPr>
+                </pic:pic>
+              </a:graphicData>
+            </a:graphic>
+          </wp:inline>
+        </w:drawing>
+      </w:r>
+    </w:p>
+    <w:p>
+      <w:pPr>
+        <w:jc w:val="center"/>
+      </w:pPr>
+      <w:r>
+        <w:rPr>
+          <w:rFonts w:ascii="宋体" w:hAnsi="宋体" w:eastAsia="宋体"/>
+          <w:sz w:val="18"/>
+        </w:rPr>
+        <w:t>图 1  TuSimple 真实训练过程 TensorBoard 曲线</w:t>
       </w:r>
     </w:p>
     <w:p>
@@ -2393,6 +2444,57 @@
     </w:p>
     <w:p>
       <w:pPr>
+        <w:jc w:val="center"/>
+      </w:pPr>
+      <w:r>
+        <w:drawing>
+          <wp:inline xmlns:a="http://schemas.openxmlformats.org/drawingml/2006/main" xmlns:pic="http://schemas.openxmlformats.org/drawingml/2006/picture">
+            <wp:extent cx="6035040" cy="2199209"/>
+            <wp:docPr id="2" name="Picture 2"/>
+            <wp:cNvGraphicFramePr>
+              <a:graphicFrameLocks noChangeAspect="1"/>
+            </wp:cNvGraphicFramePr>
+            <a:graphic>
+              <a:graphicData uri="http://schemas.openxmlformats.org/drawingml/2006/picture">
+                <pic:pic>
+                  <pic:nvPicPr>
+                    <pic:cNvPr id="0" name="onnx_runtime_tusimple_examples.png"/>
+                    <pic:cNvPicPr/>
+                  </pic:nvPicPr>
+                  <pic:blipFill>
+                    <a:blip r:embed="rId10"/>
+                    <a:stretch>
+                      <a:fillRect/>
+                    </a:stretch>
+                  </pic:blipFill>
+                  <pic:spPr>
+                    <a:xfrm>
+                      <a:off x="0" y="0"/>
+                      <a:ext cx="6035040" cy="2199209"/>
+                    </a:xfrm>
+                    <a:prstGeom prst="rect"/>
+                  </pic:spPr>
+                </pic:pic>
+              </a:graphicData>
+            </a:graphic>
+          </wp:inline>
+        </w:drawing>
+      </w:r>
+    </w:p>
+    <w:p>
+      <w:pPr>
+        <w:jc w:val="center"/>
+      </w:pPr>
+      <w:r>
+        <w:rPr>
+          <w:rFonts w:ascii="宋体" w:hAnsi="宋体" w:eastAsia="宋体"/>
+          <w:sz w:val="18"/>
+        </w:rPr>
+        <w:t>图 2  ONNX Runtime 在真实 test ROI 上的推理结果展示</w:t>
+      </w:r>
+    </w:p>
+    <w:p>
+      <w:pPr>
         <w:spacing w:before="60" w:after="120"/>
         <w:ind w:left="360"/>
       </w:pPr>

</xml_diff>